<commit_message>
Configuraciones finales en todos los objetivos. Configuracion del formato PDF y cambio de formatos por validacion de año.
</commit_message>
<xml_diff>
--- a/PlantillaMVC/PlantillasReportes/DocTest_new.docx
+++ b/PlantillaMVC/PlantillasReportes/DocTest_new.docx
@@ -741,20 +741,39 @@
     </w:p>
     <w:p>
       <w:pPr>
-        <w:ind w:left="-652" w:right="-680" w:hanging="425"/>
-        <w:jc w:val="center"/>
+        <w:pStyle w:val="Ttulo1"/>
+        <w:ind w:left="-567" w:right="-283" w:firstLine="567"/>
         <w:rPr>
-          <w:rFonts w:cs="Consolas"/>
-          <w:color w:val="A31515"/>
-          <w:sz w:val="19"/>
-          <w:szCs w:val="19"/>
+          <w:rFonts w:asciiTheme="minorHAnsi" w:hAnsiTheme="minorHAnsi"/>
+          <w:b/>
+          <w:color w:val="FFFFFF" w:themeColor="background1"/>
+          <w:lang w:eastAsia="es-MX"/>
         </w:rPr>
       </w:pPr>
+      <w:r>
+        <w:rPr>
+          <w:rFonts w:asciiTheme="minorHAnsi" w:hAnsiTheme="minorHAnsi"/>
+          <w:b/>
+          <w:color w:val="FFFFFF" w:themeColor="background1"/>
+          <w:sz w:val="36"/>
+          <w:szCs w:val="36"/>
+          <w:lang w:eastAsia="es-MX"/>
+        </w:rPr>
+        <w:t>Evaluación</w:t>
+      </w:r>
+      <w:r>
+        <w:rPr>
+          <w:rFonts w:asciiTheme="minorHAnsi" w:hAnsiTheme="minorHAnsi"/>
+          <w:b/>
+          <w:color w:val="FFFFFF" w:themeColor="background1"/>
+          <w:lang w:eastAsia="es-MX"/>
+        </w:rPr>
+        <w:t xml:space="preserve"> del Desempeño</w:t>
+      </w:r>
     </w:p>
     <w:p>
       <w:pPr>
-        <w:ind w:left="-652" w:right="-680" w:hanging="425"/>
-        <w:jc w:val="center"/>
+        <w:ind w:right="-680"/>
         <w:rPr>
           <w:rFonts w:cs="Consolas"/>
           <w:color w:val="A31515"/>

</xml_diff>